<commit_message>
feat: record licensed states, add Iowa locum leads, update letters and resumes
Co-Authored-By: Claude Sonnet 5.5 <noreply@anthropic.com>
Claude-Session: https://claude.ai/code/session_017MCnjkXrDunu8R82jEPjBh
</commit_message>
<xml_diff>
--- a/applications/site/documents/abbvie-cra1-derm-resume.docx
+++ b/applications/site/documents/abbvie-cra1-derm-resume.docx
@@ -256,7 +256,25 @@
         <w:spacing w:after="40"/>
       </w:pPr>
       <w:r>
+        <w:t>Physician Assistant license – Iowa; Indiana</w:t>
+      </w:r>
+    </w:p>
+    <w:p>
+      <w:pPr>
+        <w:pStyle w:val="ListBullet"/>
+        <w:spacing w:after="40"/>
+      </w:pPr>
+      <w:r>
         <w:t>California PA license – application in progress, expected January 2027</w:t>
+      </w:r>
+    </w:p>
+    <w:p>
+      <w:pPr>
+        <w:pStyle w:val="ListBullet"/>
+        <w:spacing w:after="40"/>
+      </w:pPr>
+      <w:r>
+        <w:t>Illinois PA license – application in progress</w:t>
       </w:r>
     </w:p>
     <w:p>

</xml_diff>

<commit_message>
feat: add PALS certification and clear PALS gap flags
Co-Authored-By: Claude Sonnet 5.5 <noreply@anthropic.com>
Claude-Session: https://claude.ai/code/session_017MCnjkXrDunu8R82jEPjBh
</commit_message>
<xml_diff>
--- a/applications/site/documents/abbvie-cra1-derm-resume.docx
+++ b/applications/site/documents/abbvie-cra1-derm-resume.docx
@@ -239,6 +239,15 @@
       </w:pPr>
       <w:r>
         <w:t>Advanced Trauma Life Support (ATLS) – October 2025 to October 2029</w:t>
+      </w:r>
+    </w:p>
+    <w:p>
+      <w:pPr>
+        <w:pStyle w:val="ListBullet"/>
+        <w:spacing w:after="40"/>
+      </w:pPr>
+      <w:r>
+        <w:t>Pediatric Advanced Life Support (PALS)</w:t>
       </w:r>
     </w:p>
     <w:p>

</xml_diff>

<commit_message>
feat: add IU Simon CRA duties to resumes and letters
Co-Authored-By: Claude Sonnet 5.5 <noreply@anthropic.com>
Claude-Session: https://claude.ai/code/session_017MCnjkXrDunu8R82jEPjBh
</commit_message>
<xml_diff>
--- a/applications/site/documents/abbvie-cra1-derm-resume.docx
+++ b/applications/site/documents/abbvie-cra1-derm-resume.docx
@@ -318,6 +318,33 @@
       </w:pPr>
       <w:r>
         <w:t>IU Simon Comprehensive Cancer Center</w:t>
+      </w:r>
+    </w:p>
+    <w:p>
+      <w:pPr>
+        <w:pStyle w:val="ListBullet"/>
+        <w:spacing w:after="40"/>
+      </w:pPr>
+      <w:r>
+        <w:t>Managed breast and OB oncology clinical trials.</w:t>
+      </w:r>
+    </w:p>
+    <w:p>
+      <w:pPr>
+        <w:pStyle w:val="ListBullet"/>
+        <w:spacing w:after="40"/>
+      </w:pPr>
+      <w:r>
+        <w:t>Kept study sponsors updated on trial progress.</w:t>
+      </w:r>
+    </w:p>
+    <w:p>
+      <w:pPr>
+        <w:pStyle w:val="ListBullet"/>
+        <w:spacing w:after="40"/>
+      </w:pPr>
+      <w:r>
+        <w:t>Updated study records and confirmed record keeping.</w:t>
       </w:r>
     </w:p>
     <w:p>

</xml_diff>